<commit_message>
Clarify pre-lab release and section deadlines
</commit_message>
<xml_diff>
--- a/site/docs/Syllabus_MIE402_Fall26_6Labs.docx
+++ b/site/docs/Syllabus_MIE402_Fall26_6Labs.docx
@@ -1095,7 +1095,7 @@
         <w:rPr>
           <w:rFonts w:asciiTheme="majorBidi" w:hAnsiTheme="majorBidi" w:cstheme="majorBidi"/>
         </w:rPr>
-        <w:t>Each pre-lab assignment is due on Canvas before the student's own laboratory section begins. Solutions may be posted after the final section for that experiment; late pre-labs will not be accepted.</w:t>
+        <w:t>Pre-lab assignments are normally posted on Canvas on the Monday before the corresponding laboratory. Each assignment is due before the student's own laboratory section begins. Because laboratory sections meet Tuesday through Friday, due times differ by section. Solutions may be posted after the final section for that experiment; late pre-labs will not be accepted.</w:t>
       </w:r>
     </w:p>
     <w:p>
@@ -5509,13 +5509,12 @@
           <w:rFonts w:asciiTheme="majorBidi" w:hAnsiTheme="majorBidi" w:cstheme="majorBidi"/>
           <w:b/>
         </w:rPr>
-        <w:t xml:space="preserve">Important scheduling note. </w:t>
+        <w:t>Important scheduling note. Pre-labs are normally posted on Canvas on the Monday before the corresponding laboratory and are due before each student's own section. Section-specific changes or make-ups will be announced on Canvas.</w:t>
       </w:r>
       <w:r>
         <w:rPr>
           <w:rFonts w:asciiTheme="majorBidi" w:hAnsiTheme="majorBidi" w:cstheme="majorBidi"/>
         </w:rPr>
-        <w:t>Pre-labs are due before each student's section. Section-specific changes or make-ups will be announced on Canvas.</w:t>
       </w:r>
     </w:p>
     <w:p>

</xml_diff>